<commit_message>
Update site: Jackpot Justice online first, obfuscation under review, 64 labs, current CV
- Jackpot Justice listed as published online first with DOI
- Obfuscation paper marked under review at Social Problems
- Research interests broadened on the CV page
- Labs: Born Lucky and Life Chances v2, updated Family Measured, Drug Laws,
  The Paycheck: Texas, and 15 Research Methods labs (64 total)
- Downloadable CV replaced with the current master CV
- Removed the Website/ subfolder and root CV copies from the Oct 20 upload,
  which had been placed outside the site root

Co-Authored-By: Claude Opus 5.5 <noreply@anthropic.com>
Claude-Session: https://claude.ai/code/session_01JPtSmHCz37VWmHFmSQPiNa
</commit_message>
<xml_diff>
--- a/assets/cv/Membrez-Weiler_CV.docx
+++ b/assets/cv/Membrez-Weiler_CV.docx
@@ -152,6 +152,18 @@
               </w:r>
             </w:hyperlink>
           </w:p>
+          <w:p>
+            <w:pPr>
+              <w:spacing w:before="0" w:after="0"/>
+              <w:jc w:val="right"/>
+            </w:pPr>
+            <w:r>
+              <w:rPr>
+                <w:color w:val="1F2A36"/>
+              </w:rPr>
+              <w:t>membrezweiler.com</w:t>
+            </w:r>
+          </w:p>
         </w:tc>
       </w:tr>
     </w:tbl>
@@ -215,7 +227,7 @@
         <w:t>The Dynamics of Wage Theft: Organizational Obfuscation, Citizenship, and Voice</w:t>
       </w:r>
       <w:r>
-        <w:t>. Chair: Martha Crowley.</w:t>
+        <w:t>. Committee: Martha Crowley (chair), Thomas Shriver, Steve McDonald, and Stacy De Coster.</w:t>
       </w:r>
     </w:p>
     <w:p>
@@ -514,6 +526,122 @@
               <w:spacing w:before="0" w:after="0"/>
             </w:pPr>
             <w:r>
+              <w:t>Criminology</w:t>
+            </w:r>
+          </w:p>
+        </w:tc>
+      </w:tr>
+      <w:tr>
+        <w:tblPrEx>
+          <w:tblCellMar>
+            <w:top w:w="0" w:type="dxa"/>
+            <w:bottom w:w="0" w:type="dxa"/>
+          </w:tblCellMar>
+        </w:tblPrEx>
+        <w:tc>
+          <w:tcPr>
+            <w:tcW w:w="4896" w:type="dxa"/>
+            <w:tcBorders>
+              <w:top w:val="none" w:sz="0" w:space="0" w:color="FFFFFF"/>
+              <w:left w:val="none" w:sz="0" w:space="0" w:color="FFFFFF"/>
+              <w:bottom w:val="none" w:sz="0" w:space="0" w:color="FFFFFF"/>
+              <w:right w:val="none" w:sz="0" w:space="0" w:color="FFFFFF"/>
+            </w:tcBorders>
+            <w:tcMar>
+              <w:top w:w="40" w:type="dxa"/>
+              <w:left w:w="288" w:type="dxa"/>
+              <w:bottom w:w="40" w:type="dxa"/>
+              <w:right w:w="0" w:type="dxa"/>
+            </w:tcMar>
+          </w:tcPr>
+          <w:p>
+            <w:pPr>
+              <w:spacing w:before="0" w:after="0"/>
+            </w:pPr>
+            <w:r>
+              <w:t>Work and Labor</w:t>
+            </w:r>
+          </w:p>
+        </w:tc>
+        <w:tc>
+          <w:tcPr>
+            <w:tcW w:w="4896" w:type="dxa"/>
+            <w:tcBorders>
+              <w:top w:val="none" w:sz="0" w:space="0" w:color="FFFFFF"/>
+              <w:left w:val="none" w:sz="0" w:space="0" w:color="FFFFFF"/>
+              <w:bottom w:val="none" w:sz="0" w:space="0" w:color="FFFFFF"/>
+              <w:right w:val="none" w:sz="0" w:space="0" w:color="FFFFFF"/>
+            </w:tcBorders>
+            <w:tcMar>
+              <w:top w:w="40" w:type="dxa"/>
+              <w:left w:w="288" w:type="dxa"/>
+              <w:bottom w:w="40" w:type="dxa"/>
+              <w:right w:w="0" w:type="dxa"/>
+            </w:tcMar>
+          </w:tcPr>
+          <w:p>
+            <w:pPr>
+              <w:spacing w:before="0" w:after="0"/>
+            </w:pPr>
+            <w:r>
+              <w:t>White-Collar and Corporate Crime</w:t>
+            </w:r>
+          </w:p>
+        </w:tc>
+      </w:tr>
+      <w:tr>
+        <w:tblPrEx>
+          <w:tblCellMar>
+            <w:top w:w="0" w:type="dxa"/>
+            <w:bottom w:w="0" w:type="dxa"/>
+          </w:tblCellMar>
+        </w:tblPrEx>
+        <w:tc>
+          <w:tcPr>
+            <w:tcW w:w="4896" w:type="dxa"/>
+            <w:tcBorders>
+              <w:top w:val="none" w:sz="0" w:space="0" w:color="FFFFFF"/>
+              <w:left w:val="none" w:sz="0" w:space="0" w:color="FFFFFF"/>
+              <w:bottom w:val="none" w:sz="0" w:space="0" w:color="FFFFFF"/>
+              <w:right w:val="none" w:sz="0" w:space="0" w:color="FFFFFF"/>
+            </w:tcBorders>
+            <w:tcMar>
+              <w:top w:w="40" w:type="dxa"/>
+              <w:left w:w="288" w:type="dxa"/>
+              <w:bottom w:w="40" w:type="dxa"/>
+              <w:right w:w="0" w:type="dxa"/>
+            </w:tcMar>
+          </w:tcPr>
+          <w:p>
+            <w:pPr>
+              <w:spacing w:before="0" w:after="0"/>
+            </w:pPr>
+            <w:r>
+              <w:t>Inequality</w:t>
+            </w:r>
+          </w:p>
+        </w:tc>
+        <w:tc>
+          <w:tcPr>
+            <w:tcW w:w="4896" w:type="dxa"/>
+            <w:tcBorders>
+              <w:top w:val="none" w:sz="0" w:space="0" w:color="FFFFFF"/>
+              <w:left w:val="none" w:sz="0" w:space="0" w:color="FFFFFF"/>
+              <w:bottom w:val="none" w:sz="0" w:space="0" w:color="FFFFFF"/>
+              <w:right w:val="none" w:sz="0" w:space="0" w:color="FFFFFF"/>
+            </w:tcBorders>
+            <w:tcMar>
+              <w:top w:w="40" w:type="dxa"/>
+              <w:left w:w="288" w:type="dxa"/>
+              <w:bottom w:w="40" w:type="dxa"/>
+              <w:right w:w="0" w:type="dxa"/>
+            </w:tcMar>
+          </w:tcPr>
+          <w:p>
+            <w:pPr>
+              <w:spacing w:before="0" w:after="0"/>
+            </w:pPr>
+            <w:r>
               <w:t>Sociology of Gambling</w:t>
             </w:r>
           </w:p>
@@ -547,7 +675,7 @@
               <w:spacing w:before="0" w:after="0"/>
             </w:pPr>
             <w:r>
-              <w:t>White-Collar and Corporate Crime</w:t>
+              <w:t>Economic Sociology</w:t>
             </w:r>
           </w:p>
         </w:tc>
@@ -577,6 +705,64 @@
           </w:p>
         </w:tc>
       </w:tr>
+      <w:tr>
+        <w:tblPrEx>
+          <w:tblCellMar>
+            <w:top w:w="0" w:type="dxa"/>
+            <w:bottom w:w="0" w:type="dxa"/>
+          </w:tblCellMar>
+        </w:tblPrEx>
+        <w:tc>
+          <w:tcPr>
+            <w:tcW w:w="4896" w:type="dxa"/>
+            <w:tcBorders>
+              <w:top w:val="none" w:sz="0" w:space="0" w:color="FFFFFF"/>
+              <w:left w:val="none" w:sz="0" w:space="0" w:color="FFFFFF"/>
+              <w:bottom w:val="none" w:sz="0" w:space="0" w:color="FFFFFF"/>
+              <w:right w:val="none" w:sz="0" w:space="0" w:color="FFFFFF"/>
+            </w:tcBorders>
+            <w:tcMar>
+              <w:top w:w="40" w:type="dxa"/>
+              <w:left w:w="288" w:type="dxa"/>
+              <w:bottom w:w="40" w:type="dxa"/>
+              <w:right w:w="0" w:type="dxa"/>
+            </w:tcMar>
+          </w:tcPr>
+          <w:p>
+            <w:pPr>
+              <w:spacing w:before="0" w:after="0"/>
+            </w:pPr>
+            <w:r>
+              <w:t>Law and Society</w:t>
+            </w:r>
+          </w:p>
+        </w:tc>
+        <w:tc>
+          <w:tcPr>
+            <w:tcW w:w="4896" w:type="dxa"/>
+            <w:tcBorders>
+              <w:top w:val="none" w:sz="0" w:space="0" w:color="FFFFFF"/>
+              <w:left w:val="none" w:sz="0" w:space="0" w:color="FFFFFF"/>
+              <w:bottom w:val="none" w:sz="0" w:space="0" w:color="FFFFFF"/>
+              <w:right w:val="none" w:sz="0" w:space="0" w:color="FFFFFF"/>
+            </w:tcBorders>
+            <w:tcMar>
+              <w:top w:w="40" w:type="dxa"/>
+              <w:left w:w="288" w:type="dxa"/>
+              <w:bottom w:w="40" w:type="dxa"/>
+              <w:right w:w="0" w:type="dxa"/>
+            </w:tcMar>
+          </w:tcPr>
+          <w:p>
+            <w:pPr>
+              <w:spacing w:before="0" w:after="0"/>
+            </w:pPr>
+            <w:r>
+              <w:t>Qualitative Methods</w:t>
+            </w:r>
+          </w:p>
+        </w:tc>
+      </w:tr>
     </w:tbl>
     <w:p>
       <w:pPr>
@@ -642,31 +828,33 @@
         <w:ind w:left="1080" w:hanging="792"/>
       </w:pPr>
       <w:r>
-        <w:t>2023</w:t>
-      </w:r>
-      <w:r>
+        <w:rPr/>
+        <w:t>2026</w:t>
+      </w:r>
+      <w:r>
+        <w:rPr/>
         <w:tab/>
-        <w:t xml:space="preserve">McDonald, Steve, Amanda Damarin, and </w:t>
-      </w:r>
-      <w:r>
-        <w:rPr>
-          <w:b/>
-          <w:bCs/>
+        <w:t xml:space="preserve">Pitman, Brian, </w:t>
+      </w:r>
+      <w:r>
+        <w:rPr>
+          <w:b/>
         </w:rPr>
         <w:t>Nicholas J. Membrez-Weiler</w:t>
       </w:r>
       <w:r>
-        <w:t xml:space="preserve">. “Organizational Perspectives on Digital Labor Market Intermediaries.” </w:t>
+        <w:rPr/>
+        <w:t xml:space="preserve">, MacKenzie A. Kibler, and Cedric Michel. “Jackpot Justice: Predation, Profit, and State-Corporate Crime in Online Gambling.” </w:t>
       </w:r>
       <w:r>
         <w:rPr>
           <w:i/>
-          <w:iCs/>
-        </w:rPr>
-        <w:t>Sociology Compass</w:t>
-      </w:r>
-      <w:r>
-        <w:t xml:space="preserve"> 17(4):1–15.</w:t>
+        </w:rPr>
+        <w:t>Journal of White Collar and Corporate Crime</w:t>
+      </w:r>
+      <w:r>
+        <w:rPr/>
+        <w:t>. Online first. doi:10.1177/2631309X261501530</w:t>
       </w:r>
     </w:p>
     <w:p>
@@ -679,6 +867,43 @@
         <w:ind w:left="1080" w:hanging="792"/>
       </w:pPr>
       <w:r>
+        <w:t>2023</w:t>
+      </w:r>
+      <w:r>
+        <w:tab/>
+        <w:t xml:space="preserve">McDonald, Steve, Amanda Damarin, and </w:t>
+      </w:r>
+      <w:r>
+        <w:rPr>
+          <w:b/>
+          <w:bCs/>
+        </w:rPr>
+        <w:t>Nicholas J. Membrez-Weiler</w:t>
+      </w:r>
+      <w:r>
+        <w:t xml:space="preserve">. “Organizational Perspectives on Digital Labor Market Intermediaries.” </w:t>
+      </w:r>
+      <w:r>
+        <w:rPr>
+          <w:i/>
+          <w:iCs/>
+        </w:rPr>
+        <w:t>Sociology Compass</w:t>
+      </w:r>
+      <w:r>
+        <w:t xml:space="preserve"> 17(4):1–15.</w:t>
+      </w:r>
+    </w:p>
+    <w:p>
+      <w:pPr>
+        <w:keepLines/>
+        <w:tabs>
+          <w:tab w:val="left" w:pos="1080"/>
+        </w:tabs>
+        <w:spacing w:before="50" w:after="50"/>
+        <w:ind w:left="1080" w:hanging="792"/>
+      </w:pPr>
+      <w:r>
         <w:t>2022</w:t>
       </w:r>
       <w:r>
@@ -722,7 +947,7 @@
           <w:sz w:val="22"/>
           <w:szCs w:val="22"/>
         </w:rPr>
-        <w:t>Manuscripts under review</w:t>
+        <w:t>Under review</w:t>
       </w:r>
     </w:p>
     <w:p>
@@ -731,26 +956,17 @@
         <w:ind w:left="576"/>
       </w:pPr>
       <w:r>
-        <w:t xml:space="preserve">Pitman, Brian, </w:t>
-      </w:r>
-      <w:r>
-        <w:rPr>
-          <w:b/>
-          <w:bCs/>
-        </w:rPr>
-        <w:t>Nicholas J. Membrez-Weiler</w:t>
-      </w:r>
-      <w:r>
-        <w:t xml:space="preserve">, MacKenzie A. Kibler, and Cedric Michel. “Jackpot Justice: Predation, Profit, and State-Corporate Crime in Online Gambling.” Under review at the </w:t>
+        <w:rPr/>
+        <w:t xml:space="preserve">“‘And It’s Completely Legal’: Symbolic Obfuscation and the Accomplishment of Wage Theft.” Under review at </w:t>
       </w:r>
       <w:r>
         <w:rPr>
           <w:i/>
-          <w:iCs/>
-        </w:rPr>
-        <w:t>Journal of White-Collar and Corporate Crime</w:t>
-      </w:r>
-      <w:r>
+        </w:rPr>
+        <w:t>Social Problems</w:t>
+      </w:r>
+      <w:r>
+        <w:rPr/>
         <w:t>.</w:t>
       </w:r>
     </w:p>
@@ -787,14 +1003,6 @@
       </w:r>
       <w:r>
         <w:t>. Book manuscript in preparation.</w:t>
-      </w:r>
-    </w:p>
-    <w:p>
-      <w:pPr>
-        <w:ind w:left="576"/>
-      </w:pPr>
-      <w:r>
-        <w:t>“Symbolic Obfuscation in Wage Theft and Organizational Wrongdoing.”</w:t>
       </w:r>
     </w:p>
     <w:p>
@@ -926,6 +1134,23 @@
         <w:ind w:left="1080" w:hanging="792"/>
       </w:pPr>
       <w:r>
+        <w:t>2026</w:t>
+      </w:r>
+      <w:r>
+        <w:tab/>
+        <w:t>“Who Holds the Plan? Toward a Sociology of Planning, with Preliminary Evidence on Wages.” To be presented at the Annual Meeting of the Oklahoma Sociological Association, November 2026.</w:t>
+      </w:r>
+    </w:p>
+    <w:p>
+      <w:pPr>
+        <w:keepLines/>
+        <w:tabs>
+          <w:tab w:val="left" w:pos="1080"/>
+        </w:tabs>
+        <w:spacing w:before="50" w:after="50"/>
+        <w:ind w:left="1080" w:hanging="792"/>
+      </w:pPr>
+      <w:r>
         <w:t>2025</w:t>
       </w:r>
       <w:r>
@@ -1138,7 +1363,25 @@
           <w:sz w:val="24"/>
           <w:szCs w:val="24"/>
         </w:rPr>
-        <w:t>AWARDS AND HONORS</w:t>
+        <w:t>GRANTS, AWARDS, AND HONORS</w:t>
+      </w:r>
+    </w:p>
+    <w:p>
+      <w:pPr>
+        <w:keepNext/>
+        <w:keepLines/>
+        <w:tabs>
+          <w:tab w:val="left" w:pos="1080"/>
+        </w:tabs>
+        <w:spacing w:before="50" w:after="50"/>
+        <w:ind w:left="1080" w:hanging="792"/>
+      </w:pPr>
+      <w:r>
+        <w:t>2026</w:t>
+      </w:r>
+      <w:r>
+        <w:tab/>
+        <w:t xml:space="preserve">Intramural Grant, Midwestern State University, “Betting or Forecasting? How Prediction Markets Advertise Wagering and How Courts and Regulators Describe It” ($7,500, submitted)</w:t>
       </w:r>
     </w:p>
     <w:p>
@@ -1262,7 +1505,7 @@
         <w:spacing w:before="10" w:after="10"/>
       </w:pPr>
       <w:r>
-        <w:t>SOC 1113, Introduction to Sociology</w:t>
+        <w:t>SOCL 1133, Introduction to Sociology</w:t>
       </w:r>
     </w:p>
     <w:p>
@@ -1276,7 +1519,7 @@
         <w:spacing w:before="10" w:after="10"/>
       </w:pPr>
       <w:r>
-        <w:t>SOC 3333, Criminology</w:t>
+        <w:t>SOCL 3333, Criminology</w:t>
       </w:r>
     </w:p>
     <w:p>
@@ -1291,7 +1534,7 @@
       </w:pPr>
       <w:r>
         <w:lastRenderedPageBreak/>
-        <w:t>SOC 4153, Sociological Theory</w:t>
+        <w:t>SOCL 4153, Sociological Theory</w:t>
       </w:r>
     </w:p>
     <w:p>
@@ -1305,7 +1548,7 @@
         <w:spacing w:before="10" w:after="10"/>
       </w:pPr>
       <w:r>
-        <w:t xml:space="preserve">SOC 3633, Research Methods </w:t>
+        <w:t xml:space="preserve">SOCL 3633, Research Methods </w:t>
       </w:r>
       <w:r>
         <w:rPr>
@@ -1326,13 +1569,14 @@
         <w:spacing w:before="10" w:after="10"/>
       </w:pPr>
       <w:r>
-        <w:t>White-Collar Crime (Spring 2027)</w:t>
+        <w:t xml:space="preserve">Sociology of White-Collar Crime </w:t>
       </w:r>
       <w:r>
         <w:rPr>
           <w:i/>
           <w:iCs/>
         </w:rPr>
+        <w:t>(Spring 2027)</w:t>
       </w:r>
     </w:p>
     <w:p>
@@ -1568,7 +1812,7 @@
         <w:t>North Carolina State University</w:t>
       </w:r>
       <w:r>
-        <w:t>, Raleigh, North Carolina | Instructor of Record, 2015–2020</w:t>
+        <w:t>, Raleigh, North Carolina | Instructor of Record, 2015–2021</w:t>
       </w:r>
     </w:p>
     <w:p>
@@ -2070,6 +2314,7 @@
       <w:footerReference w:type="default" r:id="rId9"/>
       <w:headerReference w:type="first" r:id="rId10"/>
       <w:footerReference w:type="first" r:id="rId11"/>
+      <w:footerReference w:type="even" r:id="rId14"/>
       <w:pgSz w:w="12240" w:h="15840"/>
       <w:pgMar w:top="1152" w:right="1080" w:bottom="1008" w:left="1080" w:header="708" w:footer="708" w:gutter="0"/>
       <w:cols w:space="720"/>
@@ -2117,7 +2362,7 @@
         <w:sz w:val="17"/>
         <w:szCs w:val="17"/>
       </w:rPr>
-      <w:t>Updated August 2026</w:t>
+      <w:t>Updated October 2026</w:t>
     </w:r>
     <w:r>
       <w:rPr>
@@ -2240,7 +2485,7 @@
         <w:sz w:val="17"/>
         <w:szCs w:val="17"/>
       </w:rPr>
-      <w:t>Updated August 2026</w:t>
+      <w:t>Updated October 2026</w:t>
     </w:r>
     <w:r>
       <w:rPr>
@@ -2347,6 +2592,16 @@
       </w:rPr>
       <w:fldChar w:fldCharType="end"/>
     </w:r>
+  </w:p>
+</w:ftr>
+</file>
+
+<file path=word/footer3.xml><?xml version="1.0" encoding="utf-8"?>
+<w:ftr xmlns:m="http://schemas.openxmlformats.org/officeDocument/2006/math" xmlns:mc="http://schemas.openxmlformats.org/markup-compatibility/2006" xmlns:mo="http://schemas.microsoft.com/office/mac/office/2008/main" xmlns:mv="urn:schemas-microsoft-com:mac:vml" xmlns:o="urn:schemas-microsoft-com:office:office" xmlns:r="http://schemas.openxmlformats.org/officeDocument/2006/relationships" xmlns:v="urn:schemas-microsoft-com:vml" xmlns:w10="urn:schemas-microsoft-com:office:word" xmlns:w14="http://schemas.microsoft.com/office/word/2010/wordml" xmlns:w="http://schemas.openxmlformats.org/wordprocessingml/2006/main" xmlns:wne="http://schemas.microsoft.com/office/word/2006/wordml" xmlns:wp14="http://schemas.microsoft.com/office/word/2010/wordprocessingDrawing" xmlns:wp="http://schemas.openxmlformats.org/drawingml/2006/wordprocessingDrawing" xmlns:wpc="http://schemas.microsoft.com/office/word/2010/wordprocessingCanvas" xmlns:wpg="http://schemas.microsoft.com/office/word/2010/wordprocessingGroup" xmlns:wpi="http://schemas.microsoft.com/office/word/2010/wordprocessingInk" xmlns:wps="http://schemas.microsoft.com/office/word/2010/wordprocessingShape" mc:Ignorable="w14 wp14">
+  <w:p>
+    <w:pPr>
+      <w:pStyle w:val="Footer"/>
+    </w:pPr>
   </w:p>
 </w:ftr>
 </file>

</xml_diff>